<commit_message>
Polish concise case study heroes and refresh Lumen minimal content.
Add split hero layouts with optimized imagery for Lumen and healthcare consulting, refine the about page and theme styles, and update related build scripts and reports.

Co-authored-by: Cursor <cursoragent@cursor.com>
</commit_message>
<xml_diff>
--- a/projects/clinician-flow/reports/Lumen_Chart_HE_Summary_Report.docx
+++ b/projects/clinician-flow/reports/Lumen_Chart_HE_Summary_Report.docx
@@ -846,14 +846,7 @@
         <w:spacing w:after="40"/>
       </w:pPr>
       <w:r>
-        <w:rPr>
-          <w:rFonts w:ascii="Calibri" w:hAnsi="Calibri"/>
-          <w:b/>
-          <w:i w:val="0"/>
-          <w:color w:val="1F2937"/>
-          <w:sz w:val="22"/>
-        </w:rPr>
-        <w:t>Pre-sign acknowledgments can be raced through with pure checkbox clicks</w:t>
+        <w:t>Pre-sign acknowledgments could be clicked through without reading</w:t>
       </w:r>
     </w:p>
     <w:p>
@@ -1013,14 +1006,7 @@
         <w:spacing w:after="80"/>
       </w:pPr>
       <w:r>
-        <w:rPr>
-          <w:rFonts w:ascii="Calibri" w:hAnsi="Calibri"/>
-          <w:b w:val="0"/>
-          <w:i w:val="0"/>
-          <w:color w:val="1F2937"/>
-          <w:sz w:val="22"/>
-        </w:rPr>
-        <w:t>Strengthen the pre-sign gate so pure checkbox-racing is harder (micro-scroll, hold-to-confirm, or progressive disclosure).</w:t>
+        <w:t>Strengthen the pre-sign gate so speed-clicking through checkboxes without reading is harder (micro-scroll, hold-to-confirm, or progressive disclosure).</w:t>
       </w:r>
     </w:p>
     <w:p>
@@ -1229,6 +1215,31 @@
       </w:r>
     </w:p>
     <w:p/>
+    <w:p>
+      <w:r>
+        <w:t>6. Relationship to Moderated Usability Testing</w:t>
+      </w:r>
+    </w:p>
+    <w:p>
+      <w:r>
+        <w:t>This heuristic evaluation was conducted separately from one moderated think-aloud session on the same prototype. The methods produced complementary, distinct findings rather than duplicate signals.</w:t>
+      </w:r>
+    </w:p>
+    <w:p>
+      <w:r>
+        <w:t>Heuristic review surfaced reversibility and recovery gaps: no Unaccept control, pre-sign gates users could click through without reading, weak write-failure recovery, and no mid-flow discard.</w:t>
+      </w:r>
+    </w:p>
+    <w:p>
+      <w:r>
+        <w:t>The moderated session surfaced learnability and semantics gaps: amber read as generic urgency, overlooked edit affordances, and the need for first-load onboarding.</w:t>
+      </w:r>
+    </w:p>
+    <w:p>
+      <w:r>
+        <w:t>Together they informed one refinement plan documented on the Lumen Chart case study site.</w:t>
+      </w:r>
+    </w:p>
     <w:p>
       <w:pPr>
         <w:spacing w:after="80"/>

</xml_diff>